<commit_message>
check_upload.py dowloaded a new additionalOECD file for salaries of all 7 states
</commit_message>
<xml_diff>
--- a/Benchmarking/Benchmarking file.docx
+++ b/Benchmarking/Benchmarking file.docx
@@ -248,6 +248,90 @@
         </w:rPr>
         <w:t>GDPsupplychain.py</w:t>
       </w:r>
+    </w:p>
+    <w:p>
+      <w:pPr>
+        <w:spacing w:after="0"/>
+        <w:rPr>
+          <w:rFonts w:asciiTheme="majorBidi" w:hAnsiTheme="majorBidi" w:cstheme="majorBidi"/>
+          <w:sz w:val="24"/>
+          <w:szCs w:val="24"/>
+          <w:lang w:val="en-US"/>
+        </w:rPr>
+      </w:pPr>
+    </w:p>
+    <w:p>
+      <w:pPr>
+        <w:spacing w:after="0"/>
+        <w:rPr>
+          <w:rFonts w:asciiTheme="majorBidi" w:hAnsiTheme="majorBidi" w:cstheme="majorBidi"/>
+          <w:sz w:val="24"/>
+          <w:szCs w:val="24"/>
+          <w:lang w:val="en-US"/>
+        </w:rPr>
+      </w:pPr>
+    </w:p>
+    <w:p>
+      <w:pPr>
+        <w:spacing w:after="0"/>
+        <w:rPr>
+          <w:rFonts w:asciiTheme="majorBidi" w:hAnsiTheme="majorBidi" w:cstheme="majorBidi"/>
+          <w:sz w:val="24"/>
+          <w:szCs w:val="24"/>
+          <w:lang w:val="en-US"/>
+        </w:rPr>
+      </w:pPr>
+    </w:p>
+    <w:p>
+      <w:pPr>
+        <w:spacing w:after="0"/>
+        <w:rPr>
+          <w:rFonts w:asciiTheme="majorBidi" w:hAnsiTheme="majorBidi" w:cstheme="majorBidi"/>
+          <w:sz w:val="24"/>
+          <w:szCs w:val="24"/>
+          <w:lang w:val="en-IL"/>
+        </w:rPr>
+      </w:pPr>
+      <w:r>
+        <w:rPr>
+          <w:rFonts w:asciiTheme="majorBidi" w:hAnsiTheme="majorBidi" w:cstheme="majorBidi"/>
+          <w:sz w:val="24"/>
+          <w:szCs w:val="24"/>
+          <w:lang w:val="en-IL"/>
+        </w:rPr>
+        <w:t>data2.columns</w:t>
+      </w:r>
+    </w:p>
+    <w:p>
+      <w:pPr>
+        <w:spacing w:after="0"/>
+        <w:rPr>
+          <w:rFonts w:asciiTheme="majorBidi" w:hAnsiTheme="majorBidi" w:cstheme="majorBidi"/>
+          <w:sz w:val="24"/>
+          <w:szCs w:val="24"/>
+          <w:lang w:val="en-IL"/>
+        </w:rPr>
+      </w:pPr>
+      <w:r>
+        <w:rPr>
+          <w:rFonts w:asciiTheme="majorBidi" w:hAnsiTheme="majorBidi" w:cstheme="majorBidi"/>
+          <w:sz w:val="24"/>
+          <w:szCs w:val="24"/>
+          <w:lang w:val="en-IL"/>
+        </w:rPr>
+        <w:t>['REF_AREA', 'Reference area', 'Transaction', 'detailed_sectors', 'Economic activity', 'VALUATION', 'Valuation', 'TIME_PERIOD', 'OBS_VALUE', 'ACCOUNTING_ENTRY', 'Accounting entry', 'OBS_STATUS', 'Observation status', 'CURRENCY', 'Currency']</w:t>
+      </w:r>
+    </w:p>
+    <w:p>
+      <w:pPr>
+        <w:spacing w:after="0"/>
+        <w:rPr>
+          <w:rFonts w:asciiTheme="majorBidi" w:hAnsiTheme="majorBidi" w:cstheme="majorBidi"/>
+          <w:sz w:val="24"/>
+          <w:szCs w:val="24"/>
+          <w:lang w:val="en-IL"/>
+        </w:rPr>
+      </w:pPr>
     </w:p>
     <w:p>
       <w:pPr>
@@ -904,7 +988,6 @@
   <w:style w:type="character" w:default="1" w:styleId="DefaultParagraphFont">
     <w:name w:val="Default Paragraph Font"/>
     <w:uiPriority w:val="1"/>
-    <w:semiHidden/>
     <w:unhideWhenUsed/>
   </w:style>
   <w:style w:type="table" w:default="1" w:styleId="TableNormal">

</xml_diff>

<commit_message>
GDPsupplychain.py is ready to start on graph 3, GDP supply chain
</commit_message>
<xml_diff>
--- a/Benchmarking/Benchmarking file.docx
+++ b/Benchmarking/Benchmarking file.docx
@@ -278,102 +278,387 @@
           <w:rFonts w:asciiTheme="majorBidi" w:hAnsiTheme="majorBidi" w:cstheme="majorBidi"/>
           <w:sz w:val="24"/>
           <w:szCs w:val="24"/>
-          <w:lang w:val="en-US"/>
-        </w:rPr>
-      </w:pPr>
-    </w:p>
-    <w:p>
-      <w:pPr>
-        <w:spacing w:after="0"/>
-        <w:rPr>
-          <w:rFonts w:asciiTheme="majorBidi" w:hAnsiTheme="majorBidi" w:cstheme="majorBidi"/>
-          <w:sz w:val="24"/>
-          <w:szCs w:val="24"/>
-          <w:lang w:val="en-IL"/>
-        </w:rPr>
-      </w:pPr>
-      <w:r>
-        <w:rPr>
-          <w:rFonts w:asciiTheme="majorBidi" w:hAnsiTheme="majorBidi" w:cstheme="majorBidi"/>
-          <w:sz w:val="24"/>
-          <w:szCs w:val="24"/>
-          <w:lang w:val="en-IL"/>
-        </w:rPr>
-        <w:t>data2.columns</w:t>
-      </w:r>
-    </w:p>
-    <w:p>
-      <w:pPr>
-        <w:spacing w:after="0"/>
-        <w:rPr>
-          <w:rFonts w:asciiTheme="majorBidi" w:hAnsiTheme="majorBidi" w:cstheme="majorBidi"/>
-          <w:sz w:val="24"/>
-          <w:szCs w:val="24"/>
-          <w:lang w:val="en-IL"/>
-        </w:rPr>
-      </w:pPr>
-      <w:r>
-        <w:rPr>
-          <w:rFonts w:asciiTheme="majorBidi" w:hAnsiTheme="majorBidi" w:cstheme="majorBidi"/>
-          <w:sz w:val="24"/>
-          <w:szCs w:val="24"/>
-          <w:lang w:val="en-IL"/>
-        </w:rPr>
-        <w:t>['REF_AREA', 'Reference area', 'Transaction', 'detailed_sectors', 'Economic activity', 'VALUATION', 'Valuation', 'TIME_PERIOD', 'OBS_VALUE', 'ACCOUNTING_ENTRY', 'Accounting entry', 'OBS_STATUS', 'Observation status', 'CURRENCY', 'Currency']</w:t>
-      </w:r>
-    </w:p>
-    <w:p>
-      <w:pPr>
-        <w:spacing w:after="0"/>
-        <w:rPr>
-          <w:rFonts w:asciiTheme="majorBidi" w:hAnsiTheme="majorBidi" w:cstheme="majorBidi"/>
-          <w:sz w:val="24"/>
-          <w:szCs w:val="24"/>
-          <w:lang w:val="en-IL"/>
-        </w:rPr>
-      </w:pPr>
-    </w:p>
-    <w:p>
-      <w:pPr>
-        <w:spacing w:after="0"/>
-        <w:rPr>
-          <w:rFonts w:asciiTheme="majorBidi" w:hAnsiTheme="majorBidi" w:cstheme="majorBidi"/>
-          <w:sz w:val="24"/>
-          <w:szCs w:val="24"/>
-          <w:lang w:val="en-US"/>
-        </w:rPr>
-      </w:pPr>
-    </w:p>
-    <w:p>
-      <w:pPr>
-        <w:spacing w:after="0"/>
-        <w:rPr>
-          <w:rFonts w:asciiTheme="majorBidi" w:hAnsiTheme="majorBidi" w:cstheme="majorBidi"/>
-          <w:sz w:val="24"/>
-          <w:szCs w:val="24"/>
-          <w:lang w:val="en-US"/>
-        </w:rPr>
-      </w:pPr>
-    </w:p>
-    <w:p>
-      <w:pPr>
-        <w:spacing w:after="0"/>
-        <w:rPr>
-          <w:rFonts w:asciiTheme="majorBidi" w:hAnsiTheme="majorBidi" w:cstheme="majorBidi"/>
-          <w:sz w:val="24"/>
-          <w:szCs w:val="24"/>
-          <w:lang w:val="en-US"/>
-        </w:rPr>
-      </w:pPr>
-    </w:p>
-    <w:p>
-      <w:pPr>
-        <w:spacing w:after="0"/>
-        <w:rPr>
-          <w:rFonts w:asciiTheme="majorBidi" w:hAnsiTheme="majorBidi" w:cstheme="majorBidi"/>
-          <w:sz w:val="24"/>
-          <w:szCs w:val="24"/>
-          <w:lang w:val="en-US"/>
+          <w:lang w:val="en-IL"/>
+        </w:rPr>
+      </w:pPr>
+      <w:r>
+        <w:rPr>
+          <w:rFonts w:asciiTheme="majorBidi" w:hAnsiTheme="majorBidi" w:cstheme="majorBidi"/>
+          <w:sz w:val="24"/>
+          <w:szCs w:val="24"/>
+          <w:lang w:val="en-IL"/>
+        </w:rPr>
+        <w:t># presence of sectors</w:t>
+      </w:r>
+    </w:p>
+    <w:p>
+      <w:pPr>
+        <w:spacing w:after="0"/>
+        <w:rPr>
+          <w:rFonts w:asciiTheme="majorBidi" w:hAnsiTheme="majorBidi" w:cstheme="majorBidi"/>
+          <w:sz w:val="24"/>
+          <w:szCs w:val="24"/>
+          <w:lang w:val="en-IL"/>
+        </w:rPr>
+      </w:pPr>
+      <w:r>
+        <w:rPr>
+          <w:rFonts w:asciiTheme="majorBidi" w:hAnsiTheme="majorBidi" w:cstheme="majorBidi"/>
+          <w:sz w:val="24"/>
+          <w:szCs w:val="24"/>
+          <w:lang w:val="en-IL"/>
+        </w:rPr>
+        <w:t>        all_in_OECD = set(fixed_sectors).issubset(OECD.index)</w:t>
+      </w:r>
+    </w:p>
+    <w:p>
+      <w:pPr>
+        <w:spacing w:after="0"/>
+        <w:rPr>
+          <w:rFonts w:asciiTheme="majorBidi" w:hAnsiTheme="majorBidi" w:cstheme="majorBidi"/>
+          <w:sz w:val="24"/>
+          <w:szCs w:val="24"/>
+          <w:lang w:val="en-IL"/>
+        </w:rPr>
+      </w:pPr>
+      <w:r>
+        <w:rPr>
+          <w:rFonts w:asciiTheme="majorBidi" w:hAnsiTheme="majorBidi" w:cstheme="majorBidi"/>
+          <w:sz w:val="24"/>
+          <w:szCs w:val="24"/>
+          <w:lang w:val="en-IL"/>
+        </w:rPr>
+        <w:t>        all_in_OECDadditional = set(fixed_sectors).issubset(OECDadditional.index)</w:t>
+      </w:r>
+    </w:p>
+    <w:p>
+      <w:pPr>
+        <w:spacing w:after="0"/>
+        <w:rPr>
+          <w:rFonts w:asciiTheme="majorBidi" w:hAnsiTheme="majorBidi" w:cstheme="majorBidi"/>
+          <w:sz w:val="24"/>
+          <w:szCs w:val="24"/>
+          <w:lang w:val="en-IL"/>
+        </w:rPr>
+      </w:pPr>
+      <w:r>
+        <w:rPr>
+          <w:rFonts w:asciiTheme="majorBidi" w:hAnsiTheme="majorBidi" w:cstheme="majorBidi"/>
+          <w:sz w:val="24"/>
+          <w:szCs w:val="24"/>
+          <w:lang w:val="en-IL"/>
+        </w:rPr>
+        <w:t>        print('all in OECD:', all_in_OECD)</w:t>
+      </w:r>
+    </w:p>
+    <w:p>
+      <w:pPr>
+        <w:spacing w:after="0"/>
+        <w:rPr>
+          <w:rFonts w:asciiTheme="majorBidi" w:hAnsiTheme="majorBidi" w:cstheme="majorBidi"/>
+          <w:sz w:val="24"/>
+          <w:szCs w:val="24"/>
+          <w:lang w:val="en-IL"/>
+        </w:rPr>
+      </w:pPr>
+      <w:r>
+        <w:rPr>
+          <w:rFonts w:asciiTheme="majorBidi" w:hAnsiTheme="majorBidi" w:cstheme="majorBidi"/>
+          <w:sz w:val="24"/>
+          <w:szCs w:val="24"/>
+          <w:lang w:val="en-IL"/>
+        </w:rPr>
+        <w:t>        print('all in OECDadditional:', all_in_OECDadditional)</w:t>
+      </w:r>
+    </w:p>
+    <w:p>
+      <w:pPr>
+        <w:spacing w:after="0"/>
+        <w:rPr>
+          <w:rFonts w:asciiTheme="majorBidi" w:hAnsiTheme="majorBidi" w:cstheme="majorBidi"/>
+          <w:sz w:val="24"/>
+          <w:szCs w:val="24"/>
+          <w:lang w:val="en-IL"/>
+        </w:rPr>
+      </w:pPr>
+    </w:p>
+    <w:p>
+      <w:pPr>
+        <w:spacing w:after="0"/>
+        <w:rPr>
+          <w:rFonts w:asciiTheme="majorBidi" w:hAnsiTheme="majorBidi" w:cstheme="majorBidi"/>
+          <w:sz w:val="24"/>
+          <w:szCs w:val="24"/>
+          <w:lang w:val="en-IL"/>
+        </w:rPr>
+      </w:pPr>
+    </w:p>
+    <w:p>
+      <w:pPr>
+        <w:spacing w:after="0"/>
+        <w:rPr>
+          <w:rFonts w:asciiTheme="majorBidi" w:hAnsiTheme="majorBidi" w:cstheme="majorBidi"/>
+          <w:sz w:val="24"/>
+          <w:szCs w:val="24"/>
+          <w:lang w:val="en-IL"/>
+        </w:rPr>
+      </w:pPr>
+      <w:r>
+        <w:rPr>
+          <w:rFonts w:asciiTheme="majorBidi" w:hAnsiTheme="majorBidi" w:cstheme="majorBidi"/>
+          <w:sz w:val="24"/>
+          <w:szCs w:val="24"/>
+          <w:lang w:val="en-IL"/>
+        </w:rPr>
+        <w:t>print(country, year)</w:t>
+      </w:r>
+    </w:p>
+    <w:p>
+      <w:pPr>
+        <w:spacing w:after="0"/>
+        <w:rPr>
+          <w:rFonts w:asciiTheme="majorBidi" w:hAnsiTheme="majorBidi" w:cstheme="majorBidi"/>
+          <w:sz w:val="24"/>
+          <w:szCs w:val="24"/>
+          <w:lang w:val="en-IL"/>
+        </w:rPr>
+      </w:pPr>
+      <w:r>
+        <w:rPr>
+          <w:rFonts w:asciiTheme="majorBidi" w:hAnsiTheme="majorBidi" w:cstheme="majorBidi"/>
+          <w:sz w:val="24"/>
+          <w:szCs w:val="24"/>
+          <w:lang w:val="en-IL"/>
+        </w:rPr>
+        <w:t>        if country == 'JPN':</w:t>
+      </w:r>
+    </w:p>
+    <w:p>
+      <w:pPr>
+        <w:spacing w:after="0"/>
+        <w:rPr>
+          <w:rFonts w:asciiTheme="majorBidi" w:hAnsiTheme="majorBidi" w:cstheme="majorBidi"/>
+          <w:sz w:val="24"/>
+          <w:szCs w:val="24"/>
+          <w:lang w:val="en-IL"/>
+        </w:rPr>
+      </w:pPr>
+      <w:r>
+        <w:rPr>
+          <w:rFonts w:asciiTheme="majorBidi" w:hAnsiTheme="majorBidi" w:cstheme="majorBidi"/>
+          <w:sz w:val="24"/>
+          <w:szCs w:val="24"/>
+          <w:lang w:val="en-IL"/>
+        </w:rPr>
+        <w:t>            print(simple_II_labels)</w:t>
+      </w:r>
+    </w:p>
+    <w:p>
+      <w:pPr>
+        <w:spacing w:after="0"/>
+        <w:rPr>
+          <w:rFonts w:asciiTheme="majorBidi" w:hAnsiTheme="majorBidi" w:cstheme="majorBidi"/>
+          <w:sz w:val="24"/>
+          <w:szCs w:val="24"/>
+          <w:lang w:val="en-IL"/>
+        </w:rPr>
+      </w:pPr>
+      <w:r>
+        <w:rPr>
+          <w:rFonts w:asciiTheme="majorBidi" w:hAnsiTheme="majorBidi" w:cstheme="majorBidi"/>
+          <w:sz w:val="24"/>
+          <w:szCs w:val="24"/>
+          <w:lang w:val="en-IL"/>
+        </w:rPr>
+        <w:t>            print('')</w:t>
+      </w:r>
+    </w:p>
+    <w:p>
+      <w:pPr>
+        <w:spacing w:after="0"/>
+        <w:rPr>
+          <w:rFonts w:asciiTheme="majorBidi" w:hAnsiTheme="majorBidi" w:cstheme="majorBidi"/>
+          <w:sz w:val="24"/>
+          <w:szCs w:val="24"/>
+          <w:lang w:val="en-IL"/>
+        </w:rPr>
+      </w:pPr>
+      <w:r>
+        <w:rPr>
+          <w:rFonts w:asciiTheme="majorBidi" w:hAnsiTheme="majorBidi" w:cstheme="majorBidi"/>
+          <w:sz w:val="24"/>
+          <w:szCs w:val="24"/>
+          <w:lang w:val="en-IL"/>
+        </w:rPr>
+        <w:t>            print(fixed_sectors)</w:t>
+      </w:r>
+    </w:p>
+    <w:p>
+      <w:pPr>
+        <w:spacing w:after="0"/>
+        <w:rPr>
+          <w:rFonts w:asciiTheme="majorBidi" w:hAnsiTheme="majorBidi" w:cstheme="majorBidi"/>
+          <w:sz w:val="24"/>
+          <w:szCs w:val="24"/>
+          <w:lang w:val="en-IL"/>
+        </w:rPr>
+      </w:pPr>
+      <w:r>
+        <w:rPr>
+          <w:rFonts w:asciiTheme="majorBidi" w:hAnsiTheme="majorBidi" w:cstheme="majorBidi"/>
+          <w:sz w:val="24"/>
+          <w:szCs w:val="24"/>
+          <w:lang w:val="en-IL"/>
+        </w:rPr>
+        <w:t>            print('')</w:t>
+      </w:r>
+    </w:p>
+    <w:p>
+      <w:pPr>
+        <w:spacing w:after="0"/>
+        <w:rPr>
+          <w:rFonts w:asciiTheme="majorBidi" w:hAnsiTheme="majorBidi" w:cstheme="majorBidi"/>
+          <w:sz w:val="24"/>
+          <w:szCs w:val="24"/>
+          <w:lang w:val="en-IL"/>
+        </w:rPr>
+      </w:pPr>
+      <w:r>
+        <w:rPr>
+          <w:rFonts w:asciiTheme="majorBidi" w:hAnsiTheme="majorBidi" w:cstheme="majorBidi"/>
+          <w:sz w:val="24"/>
+          <w:szCs w:val="24"/>
+          <w:lang w:val="en-IL"/>
+        </w:rPr>
+        <w:t>            print('')</w:t>
+      </w:r>
+    </w:p>
+    <w:p>
+      <w:pPr>
+        <w:spacing w:after="0"/>
+        <w:rPr>
+          <w:rFonts w:asciiTheme="majorBidi" w:hAnsiTheme="majorBidi" w:cstheme="majorBidi"/>
+          <w:sz w:val="24"/>
+          <w:szCs w:val="24"/>
+          <w:lang w:val="en-IL"/>
+        </w:rPr>
+      </w:pPr>
+    </w:p>
+    <w:p>
+      <w:pPr>
+        <w:spacing w:after="0"/>
+        <w:rPr>
+          <w:rFonts w:asciiTheme="majorBidi" w:hAnsiTheme="majorBidi" w:cstheme="majorBidi"/>
+          <w:sz w:val="24"/>
+          <w:szCs w:val="24"/>
+          <w:lang w:val="en-IL"/>
+        </w:rPr>
+      </w:pPr>
+    </w:p>
+    <w:p>
+      <w:pPr>
+        <w:spacing w:after="0"/>
+        <w:rPr>
+          <w:rFonts w:asciiTheme="majorBidi" w:hAnsiTheme="majorBidi" w:cstheme="majorBidi"/>
+          <w:sz w:val="24"/>
+          <w:szCs w:val="24"/>
+          <w:lang w:val="en-IL"/>
+        </w:rPr>
+      </w:pPr>
+    </w:p>
+    <w:p>
+      <w:pPr>
+        <w:spacing w:after="0"/>
+        <w:rPr>
+          <w:rFonts w:asciiTheme="majorBidi" w:hAnsiTheme="majorBidi" w:cstheme="majorBidi"/>
+          <w:sz w:val="24"/>
+          <w:szCs w:val="24"/>
+          <w:lang w:val="en-IL"/>
+        </w:rPr>
+      </w:pPr>
+    </w:p>
+    <w:p>
+      <w:pPr>
+        <w:spacing w:after="0"/>
+        <w:rPr>
+          <w:rFonts w:asciiTheme="majorBidi" w:hAnsiTheme="majorBidi" w:cstheme="majorBidi"/>
+          <w:sz w:val="24"/>
+          <w:szCs w:val="24"/>
+          <w:lang w:val="en-US"/>
+        </w:rPr>
+      </w:pPr>
+      <w:r>
+        <w:rPr>
+          <w:rFonts w:asciiTheme="majorBidi" w:hAnsiTheme="majorBidi" w:cstheme="majorBidi"/>
+          <w:sz w:val="24"/>
+          <w:szCs w:val="24"/>
+          <w:lang w:val="en-US"/>
+        </w:rPr>
+        <w:t>Link for SUT table</w:t>
+      </w:r>
+    </w:p>
+    <w:p>
+      <w:pPr>
+        <w:spacing w:after="0"/>
+        <w:rPr>
+          <w:rFonts w:asciiTheme="majorBidi" w:hAnsiTheme="majorBidi" w:cstheme="majorBidi"/>
+          <w:sz w:val="24"/>
+          <w:szCs w:val="24"/>
+          <w:lang w:val="en-IL"/>
+        </w:rPr>
+      </w:pPr>
+      <w:hyperlink r:id="rId4" w:history="1">
+        <w:r>
+          <w:rPr>
+            <w:rStyle w:val="Hyperlink"/>
+            <w:rFonts w:asciiTheme="majorBidi" w:hAnsiTheme="majorBidi" w:cstheme="majorBidi"/>
+            <w:sz w:val="24"/>
+            <w:szCs w:val="24"/>
+            <w:lang w:val="en-IL"/>
+          </w:rPr>
+          <w:t>https://data-explorer.oecd.org/vis?df[ds]=dsDisseminateFinalDMZ&amp;df[id]=DSD_NASU%40DF_USEVA_T1600&amp;df[ag]=OECD.SDD.NAD&amp;df[vs]=1.0&amp;hc[Transaction]=Output&amp;pg=0&amp;snb=53&amp;tm=inputoutput&amp;utm_source=chatgpt.com&amp;dq=A.FRA%2BJPN%2BUSA%2BGBR%2BITA%2BDEU%2BCAN.B2A3G%2BB2A3N%2BD11</w:t>
+        </w:r>
+        <w:r>
+          <w:rPr>
+            <w:rStyle w:val="Hyperlink"/>
+            <w:rFonts w:asciiTheme="majorBidi" w:hAnsiTheme="majorBidi" w:cstheme="majorBidi"/>
+            <w:sz w:val="24"/>
+            <w:szCs w:val="24"/>
+            <w:lang w:val="en-IL"/>
+          </w:rPr>
+          <w:t>%</w:t>
+        </w:r>
+        <w:r>
+          <w:rPr>
+            <w:rStyle w:val="Hyperlink"/>
+            <w:rFonts w:asciiTheme="majorBidi" w:hAnsiTheme="majorBidi" w:cstheme="majorBidi"/>
+            <w:sz w:val="24"/>
+            <w:szCs w:val="24"/>
+            <w:lang w:val="en-IL"/>
+          </w:rPr>
+          <w:t>2BD1%2BD29X39%2BB3G%2BB1G%2BP2%2BP1._T%2BA%2BB%2BC%2BD%2BE%2BF%2BG%2BH%2BI%2BJ%2BK%2BL%2BM%2BN%2BO%2BP%2BQ%2BR%2BS%2BT%2BU%2B_X....V.&amp;pd=2011%2C2022&amp;to[TIME_PERIOD]=false&amp;vw=tb</w:t>
+        </w:r>
+      </w:hyperlink>
+    </w:p>
+    <w:p>
+      <w:pPr>
+        <w:spacing w:after="0"/>
+        <w:rPr>
+          <w:rFonts w:asciiTheme="majorBidi" w:hAnsiTheme="majorBidi" w:cstheme="majorBidi"/>
+          <w:sz w:val="24"/>
+          <w:szCs w:val="24"/>
+          <w:lang w:val="en-IL"/>
+        </w:rPr>
+      </w:pPr>
+    </w:p>
+    <w:p>
+      <w:pPr>
+        <w:spacing w:after="0"/>
+        <w:rPr>
+          <w:rFonts w:asciiTheme="majorBidi" w:hAnsiTheme="majorBidi" w:cstheme="majorBidi"/>
+          <w:sz w:val="24"/>
+          <w:szCs w:val="24"/>
+          <w:lang w:val="en-IL"/>
         </w:rPr>
       </w:pPr>
     </w:p>
@@ -1301,6 +1586,41 @@
       <w:spacing w:val="5"/>
     </w:rPr>
   </w:style>
+  <w:style w:type="character" w:styleId="Hyperlink">
+    <w:name w:val="Hyperlink"/>
+    <w:basedOn w:val="DefaultParagraphFont"/>
+    <w:uiPriority w:val="99"/>
+    <w:unhideWhenUsed/>
+    <w:rsid w:val="00152528"/>
+    <w:rPr>
+      <w:color w:val="467886" w:themeColor="hyperlink"/>
+      <w:u w:val="single"/>
+    </w:rPr>
+  </w:style>
+  <w:style w:type="character" w:styleId="UnresolvedMention">
+    <w:name w:val="Unresolved Mention"/>
+    <w:basedOn w:val="DefaultParagraphFont"/>
+    <w:uiPriority w:val="99"/>
+    <w:semiHidden/>
+    <w:unhideWhenUsed/>
+    <w:rsid w:val="00152528"/>
+    <w:rPr>
+      <w:color w:val="605E5C"/>
+      <w:shd w:val="clear" w:color="auto" w:fill="E1DFDD"/>
+    </w:rPr>
+  </w:style>
+  <w:style w:type="character" w:styleId="FollowedHyperlink">
+    <w:name w:val="FollowedHyperlink"/>
+    <w:basedOn w:val="DefaultParagraphFont"/>
+    <w:uiPriority w:val="99"/>
+    <w:semiHidden/>
+    <w:unhideWhenUsed/>
+    <w:rsid w:val="00152528"/>
+    <w:rPr>
+      <w:color w:val="96607D" w:themeColor="followedHyperlink"/>
+      <w:u w:val="single"/>
+    </w:rPr>
+  </w:style>
 </w:styles>
 </file>
 

</xml_diff>